<commit_message>
Add manual test cases
</commit_message>
<xml_diff>
--- a/input/youtube-tests.docx
+++ b/input/youtube-tests.docx
@@ -77,10 +77,7 @@
     </w:p>
     <w:p>
       <w:r>
-        <w:t>5. Ve</w:t>
-      </w:r>
-      <w:r>
-        <w:t>rify that search results are displayed</w:t>
+        <w:t>5. Verify that search results are displayed</w:t>
       </w:r>
     </w:p>
     <w:p>
@@ -125,10 +122,7 @@
     </w:p>
     <w:p>
       <w:r>
-        <w:t>Title: Veri</w:t>
-      </w:r>
-      <w:r>
-        <w:t>fy YouTube homepage</w:t>
+        <w:t>Title: Verify YouTube homepage</w:t>
       </w:r>
     </w:p>
     <w:p>
@@ -188,10 +182,7 @@
     </w:p>
     <w:p>
       <w:r>
-        <w:t>Expected: Browser tab reads YouTu</w:t>
-      </w:r>
-      <w:r>
-        <w:t>be</w:t>
+        <w:t>Expected: Browser tab reads YouTube</w:t>
       </w:r>
     </w:p>
     <w:p/>
@@ -236,10 +227,7 @@
     </w:p>
     <w:p>
       <w:r>
-        <w:t>Expected: The page is no</w:t>
-      </w:r>
-      <w:r>
-        <w:t>t covered by the consent dialog</w:t>
+        <w:t>Expected: The page is not covered by the consent dialog</w:t>
       </w:r>
     </w:p>
     <w:p>
@@ -345,10 +333,7 @@
     </w:p>
     <w:p>
       <w:r>
-        <w:t>Expected: The page is not co</w:t>
-      </w:r>
-      <w:r>
-        <w:t>vered by the consent dialog</w:t>
+        <w:t>Expected: The page is not covered by the consent dialog</w:t>
       </w:r>
     </w:p>
     <w:p>
@@ -383,10 +368,7 @@
     </w:p>
     <w:p>
       <w:r>
-        <w:t>6. Verify that the video pag</w:t>
-      </w:r>
-      <w:r>
-        <w:t>e is displayed</w:t>
+        <w:t>6. Verify that the video page is displayed</w:t>
       </w:r>
     </w:p>
     <w:p>
@@ -431,10 +413,7 @@
     </w:p>
     <w:p>
       <w:r>
-        <w:t>Title: Search results</w:t>
-      </w:r>
-      <w:r>
-        <w:t xml:space="preserve"> match the query</w:t>
+        <w:t>Title: Search results match the query</w:t>
       </w:r>
     </w:p>
     <w:p>
@@ -469,10 +448,7 @@
     </w:p>
     <w:p>
       <w:r>
-        <w:t>3. Enter "</w:t>
-      </w:r>
-      <w:r>
-        <w:t>Playwright automation" in the search box</w:t>
+        <w:t>3. Enter "Playwright automation" in the search box</w:t>
       </w:r>
     </w:p>
     <w:p>
@@ -532,10 +508,7 @@
     </w:p>
     <w:p>
       <w:r>
-        <w:t>Title: Open a video and verify its detail</w:t>
-      </w:r>
-      <w:r>
-        <w:t>s</w:t>
+        <w:t>Title: Open a video and verify its details</w:t>
       </w:r>
     </w:p>
     <w:p>
@@ -570,10 +543,7 @@
     </w:p>
     <w:p>
       <w:r>
-        <w:t>3. Enter "</w:t>
-      </w:r>
-      <w:r>
-        <w:t>Playwright automation" in the search box</w:t>
+        <w:t>3. Enter "Playwright automation" in the search box</w:t>
       </w:r>
     </w:p>
     <w:p>
@@ -618,10 +588,7 @@
     </w:p>
     <w:p>
       <w:r>
-        <w:t>7</w:t>
-      </w:r>
-      <w:r>
-        <w:t>. Verify that the video player is visible</w:t>
+        <w:t>7. Verify that the video player is visible</w:t>
       </w:r>
     </w:p>
     <w:p>
@@ -687,10 +654,7 @@
     </w:p>
     <w:p>
       <w:r>
-        <w:t>3. Enter "Playwright automa</w:t>
-      </w:r>
-      <w:r>
-        <w:t>tion" in the search box</w:t>
+        <w:t>3. Enter "Playwright automation" in the search box</w:t>
       </w:r>
     </w:p>
     <w:p>
@@ -725,10 +689,7 @@
     </w:p>
     <w:p>
       <w:r>
-        <w:t>Expected: The brow</w:t>
-      </w:r>
-      <w:r>
-        <w:t>ser returns to the homepage</w:t>
+        <w:t>Expected: The browser returns to the homepage</w:t>
       </w:r>
     </w:p>
     <w:p>
@@ -763,10 +724,7 @@
     </w:p>
     <w:p>
       <w:r>
-        <w:t>Title: Search results mention a named</w:t>
-      </w:r>
-      <w:r>
-        <w:t xml:space="preserve"> alternative</w:t>
+        <w:t>Title: Search results mention a named alternative</w:t>
       </w:r>
     </w:p>
     <w:p>
@@ -801,10 +759,7 @@
     </w:p>
     <w:p>
       <w:r>
-        <w:t>3. Enter "</w:t>
-      </w:r>
-      <w:r>
-        <w:t xml:space="preserve">Playwright </w:t>
+        <w:t xml:space="preserve">3. Enter "Playwright </w:t>
       </w:r>
       <w:proofErr w:type="spellStart"/>
       <w:r>
@@ -842,10 +797,7 @@
     </w:p>
     <w:p>
       <w:r>
-        <w:t>6. Verify that the search results l</w:t>
-      </w:r>
-      <w:r>
-        <w:t>ist contains "Selenium"</w:t>
+        <w:t>6. Verify that the search results list contains "Selenium"</w:t>
       </w:r>
     </w:p>
     <w:p>
@@ -915,10 +867,7 @@
     </w:p>
     <w:p>
       <w:r>
-        <w:t>Expecte</w:t>
-      </w:r>
-      <w:r>
-        <w:t>d: Search is submitted</w:t>
+        <w:t>Expected: Search is submitted</w:t>
       </w:r>
     </w:p>
     <w:p>
@@ -994,10 +943,7 @@
     </w:p>
     <w:p>
       <w:r>
-        <w:t>Expected: YouTube homepa</w:t>
-      </w:r>
-      <w:r>
-        <w:t>ge is displayed</w:t>
+        <w:t>Expected: YouTube homepage is displayed</w:t>
       </w:r>
     </w:p>
     <w:p>
@@ -1022,10 +968,7 @@
     </w:p>
     <w:p>
       <w:r>
-        <w:t>4. Verify that the video player is not visibl</w:t>
-      </w:r>
-      <w:r>
-        <w:t>e</w:t>
+        <w:t>4. Verify that the video player is not visible</w:t>
       </w:r>
     </w:p>
     <w:p>
@@ -1070,10 +1013,7 @@
     </w:p>
     <w:p>
       <w:r>
-        <w:t>2. Close the cook</w:t>
-      </w:r>
-      <w:r>
-        <w:t>ie consent dialog if it is displayed</w:t>
+        <w:t>2. Close the cookie consent dialog if it is displayed</w:t>
       </w:r>
     </w:p>
     <w:p>
@@ -1103,10 +1043,7 @@
     </w:p>
     <w:p>
       <w:r>
-        <w:t xml:space="preserve">5. Verify that search </w:t>
-      </w:r>
-      <w:r>
-        <w:t>results are displayed</w:t>
+        <w:t>5. Verify that search results are displayed</w:t>
       </w:r>
     </w:p>
     <w:p>
@@ -1144,10 +1081,7 @@
     </w:p>
     <w:p>
       <w:r>
-        <w:t>8. Verify that the page title contains "</w:t>
-      </w:r>
-      <w:r>
-        <w:t xml:space="preserve">Playwright </w:t>
+        <w:t xml:space="preserve">8. Verify that the page title contains "Playwright </w:t>
       </w:r>
       <w:proofErr w:type="spellStart"/>
       <w:r>
@@ -1200,10 +1134,7 @@
     </w:p>
     <w:p>
       <w:r>
-        <w:t>2. Clo</w:t>
-      </w:r>
-      <w:r>
-        <w:t>se the cookie consent dialog if it is displayed</w:t>
+        <w:t>2. Close the cookie consent dialog if it is displayed</w:t>
       </w:r>
     </w:p>
     <w:p>
@@ -1233,10 +1164,7 @@
     </w:p>
     <w:p>
       <w:r>
-        <w:t>5. Click the firs</w:t>
-      </w:r>
-      <w:r>
-        <w:t>t search result</w:t>
+        <w:t>5. Click the first search result</w:t>
       </w:r>
     </w:p>
     <w:p>
@@ -1276,10 +1204,7 @@
     </w:p>
     <w:p>
       <w:r>
-        <w:t>Expected: The search box</w:t>
-      </w:r>
-      <w:r>
-        <w:t xml:space="preserve"> is shown in the header</w:t>
+        <w:t>Expected: The search box is shown in the header</w:t>
       </w:r>
     </w:p>
     <w:p>
@@ -1350,10 +1275,7 @@
     </w:p>
     <w:p>
       <w:r>
-        <w:t>4. Click the Search bu</w:t>
-      </w:r>
-      <w:r>
-        <w:t>tton</w:t>
+        <w:t>4. Click the Search button</w:t>
       </w:r>
     </w:p>
     <w:p>
@@ -1398,10 +1320,7 @@
     </w:p>
     <w:p>
       <w:r>
-        <w:t>1. Open https://www.youtube.co</w:t>
-      </w:r>
-      <w:r>
-        <w:t>m</w:t>
+        <w:t>1. Open https://www.youtube.com</w:t>
       </w:r>
     </w:p>
     <w:p>
@@ -1514,10 +1433,7 @@
     </w:p>
     <w:p>
       <w:r>
-        <w:t>3.</w:t>
-      </w:r>
-      <w:r>
-        <w:t xml:space="preserve"> Enter "Playwright automation" in the search box</w:t>
+        <w:t>3. Enter "Playwright automation" in the search box</w:t>
       </w:r>
     </w:p>
     <w:p>
@@ -1557,10 +1473,7 @@
     </w:p>
     <w:p>
       <w:r>
-        <w:t xml:space="preserve">Title: </w:t>
-      </w:r>
-      <w:r>
-        <w:t>Search using Enter</w:t>
+        <w:t>Title: Search using Enter</w:t>
       </w:r>
     </w:p>
     <w:p>
@@ -1595,10 +1508,7 @@
     </w:p>
     <w:p>
       <w:r>
-        <w:t>3. Enter</w:t>
-      </w:r>
-      <w:r>
-        <w:t xml:space="preserve"> "Playwright automation" in the search box</w:t>
+        <w:t>3. Enter "Playwright automation" in the search box</w:t>
       </w:r>
     </w:p>
     <w:p>
@@ -1674,10 +1584,7 @@
     </w:p>
     <w:p>
       <w:r>
-        <w:t>2. Close the cookie consent d</w:t>
-      </w:r>
-      <w:r>
-        <w:t>ialog if it is displayed</w:t>
+        <w:t>2. Close the cookie consent dialog if it is displayed</w:t>
       </w:r>
     </w:p>
     <w:p>
@@ -1707,10 +1614,7 @@
     </w:p>
     <w:p>
       <w:r>
-        <w:t>5. Verify that the URL contains "/</w:t>
-      </w:r>
-      <w:r>
-        <w:t>results"</w:t>
+        <w:t>5. Verify that the URL contains "/results"</w:t>
       </w:r>
     </w:p>
     <w:p>
@@ -1785,10 +1689,7 @@
     </w:p>
     <w:p>
       <w:r>
-        <w:t>5. Click the firs</w:t>
-      </w:r>
-      <w:r>
-        <w:t>t search result</w:t>
+        <w:t>5. Click the first search result</w:t>
       </w:r>
     </w:p>
     <w:p>
@@ -1838,10 +1739,7 @@
     </w:p>
     <w:p>
       <w:r>
-        <w:t>Preconditi</w:t>
-      </w:r>
-      <w:r>
-        <w:t>on: User has internet access.</w:t>
+        <w:t>Precondition: User has internet access.</w:t>
       </w:r>
     </w:p>
     <w:p>
@@ -1871,10 +1769,7 @@
     </w:p>
     <w:p>
       <w:r>
-        <w:t>3. Enter "Playwright automation" in t</w:t>
-      </w:r>
-      <w:r>
-        <w:t>he search box</w:t>
+        <w:t>3. Enter "Playwright automation" in the search box</w:t>
       </w:r>
     </w:p>
     <w:p>
@@ -1954,10 +1849,7 @@
     </w:p>
     <w:p>
       <w:r>
-        <w:t>Expected: The page is not cov</w:t>
-      </w:r>
-      <w:r>
-        <w:t>ered by the consent dialog</w:t>
+        <w:t>Expected: The page is not covered by the consent dialog</w:t>
       </w:r>
     </w:p>
     <w:p>
@@ -2038,14 +1930,7 @@
           <w:b/>
           <w:bCs/>
         </w:rPr>
-        <w:t xml:space="preserve">Test </w:t>
-      </w:r>
-      <w:r>
-        <w:rPr>
-          <w:b/>
-          <w:bCs/>
-        </w:rPr>
-        <w:t>Case ID: TC-YT-021</w:t>
+        <w:t>Test Case ID: TC-YT-021</w:t>
       </w:r>
     </w:p>
     <w:p>
@@ -2115,10 +2000,7 @@
     </w:p>
     <w:p>
       <w:r>
-        <w:t>6. Verify th</w:t>
-      </w:r>
-      <w:r>
-        <w:t>at the volume slider is visible</w:t>
+        <w:t>6. Verify that the volume slider is visible</w:t>
       </w:r>
     </w:p>
     <w:p>
@@ -2163,10 +2045,7 @@
     </w:p>
     <w:p>
       <w:r>
-        <w:t>1. Open https://www.youtube.</w:t>
-      </w:r>
-      <w:r>
-        <w:t>com</w:t>
+        <w:t>1. Open https://www.youtube.com</w:t>
       </w:r>
     </w:p>
     <w:p>
@@ -2189,7 +2068,10 @@
         <w:t>3. Enter "</w:t>
       </w:r>
       <w:r>
-        <w:t xml:space="preserve"> playwright automation tutorial in </w:t>
+        <w:t>playwrig</w:t>
+      </w:r>
+      <w:r>
+        <w:t xml:space="preserve">ht automation tutorial in </w:t>
       </w:r>
       <w:proofErr w:type="spellStart"/>
       <w:r>
@@ -2197,9 +2079,6 @@
       </w:r>
       <w:proofErr w:type="spellEnd"/>
       <w:r>
-        <w:t xml:space="preserve"> </w:t>
-      </w:r>
-      <w:r>
         <w:t>" in the search box</w:t>
       </w:r>
     </w:p>
@@ -2215,10 +2094,7 @@
     </w:p>
     <w:p>
       <w:r>
-        <w:t>Exp</w:t>
-      </w:r>
-      <w:r>
-        <w:t>ected: Search is submitted</w:t>
+        <w:t>Expected: Search is submitted</w:t>
       </w:r>
     </w:p>
     <w:p>
@@ -2347,10 +2223,7 @@
     </w:p>
     <w:p>
       <w:r>
-        <w:t>Expecte</w:t>
-      </w:r>
-      <w:r>
-        <w:t>d: Search is submitted</w:t>
+        <w:t>Expected: Search is submitted</w:t>
       </w:r>
     </w:p>
     <w:p>
@@ -2390,19 +2263,117 @@
           <w:b/>
           <w:bCs/>
         </w:rPr>
-        <w:t>Test Case ID: TC-YT-0</w:t>
-      </w:r>
+        <w:t>Test Case ID: TC-YT-024</w:t>
+      </w:r>
+    </w:p>
+    <w:p>
+      <w:r>
+        <w:t>Title: Expand video description</w:t>
+      </w:r>
+    </w:p>
+    <w:p>
+      <w:r>
+        <w:t>Precondition: User has internet access.</w:t>
+      </w:r>
+    </w:p>
+    <w:p>
+      <w:r>
+        <w:t>Steps:</w:t>
+      </w:r>
+    </w:p>
+    <w:p>
+      <w:r>
+        <w:t>1. Open https://www.youtube.com</w:t>
+      </w:r>
+    </w:p>
+    <w:p>
+      <w:r>
+        <w:t>Expected: YouTube homepage is displayed</w:t>
+      </w:r>
+    </w:p>
+    <w:p>
+      <w:r>
+        <w:t>2. Close the cookie consent dialog if it is displayed</w:t>
+      </w:r>
+    </w:p>
+    <w:p>
+      <w:r>
+        <w:t>Expected: The page is not covered by the consent dialog</w:t>
+      </w:r>
+    </w:p>
+    <w:p>
+      <w:r>
+        <w:t>3. Enter "Playwright automation" in the search box</w:t>
+      </w:r>
+    </w:p>
+    <w:p>
+      <w:r>
+        <w:t>Expected: Search text is entered</w:t>
+      </w:r>
+    </w:p>
+    <w:p>
+      <w:r>
+        <w:t>4. Press Enter</w:t>
+      </w:r>
+    </w:p>
+    <w:p>
+      <w:r>
+        <w:t>Expected: Search is submitted</w:t>
+      </w:r>
+    </w:p>
+    <w:p>
+      <w:r>
+        <w:t>5. Click the first search result</w:t>
+      </w:r>
+    </w:p>
+    <w:p>
+      <w:r>
+        <w:t>Expected: The video opens</w:t>
+      </w:r>
+    </w:p>
+    <w:p>
+      <w:r>
+        <w:t>6. Verify that the expanded description is not visible</w:t>
+      </w:r>
+    </w:p>
+    <w:p>
+      <w:r>
+        <w:t>Expected: The description starts collapsed</w:t>
+      </w:r>
+    </w:p>
+    <w:p>
+      <w:r>
+        <w:t>7. Click the Show more button</w:t>
+      </w:r>
+    </w:p>
+    <w:p>
+      <w:r>
+        <w:t>Expected: The description expands</w:t>
+      </w:r>
+    </w:p>
+    <w:p>
+      <w:r>
+        <w:t>8. Verify that the expanded description is visible</w:t>
+      </w:r>
+    </w:p>
+    <w:p>
+      <w:r>
+        <w:t>Expected: The rest of the description is shown</w:t>
+      </w:r>
+    </w:p>
+    <w:p/>
+    <w:p>
       <w:r>
         <w:rPr>
           <w:b/>
           <w:bCs/>
         </w:rPr>
-        <w:t>24</w:t>
-      </w:r>
-    </w:p>
-    <w:p>
-      <w:r>
-        <w:t>Title: Expand video description</w:t>
+        <w:t>Test Case ID: TC-YT-025</w:t>
+      </w:r>
+    </w:p>
+    <w:p>
+      <w:r>
+        <w:t>Title: Open channel from a video</w:t>
       </w:r>
     </w:p>
     <w:p>
@@ -2433,124 +2404,6 @@
     <w:p>
       <w:r>
         <w:t>Expected: The page is not covered by the consent dialog</w:t>
-      </w:r>
-    </w:p>
-    <w:p>
-      <w:r>
-        <w:t>3. Enter "Playwright automation" in the search box</w:t>
-      </w:r>
-    </w:p>
-    <w:p>
-      <w:r>
-        <w:t>Expected: Search text is entered</w:t>
-      </w:r>
-    </w:p>
-    <w:p>
-      <w:r>
-        <w:t>4. Press Enter</w:t>
-      </w:r>
-    </w:p>
-    <w:p>
-      <w:r>
-        <w:t>Expected: Search is submitted</w:t>
-      </w:r>
-    </w:p>
-    <w:p>
-      <w:r>
-        <w:t>5. Click the first search result</w:t>
-      </w:r>
-    </w:p>
-    <w:p>
-      <w:r>
-        <w:t>Expected: The video opens</w:t>
-      </w:r>
-    </w:p>
-    <w:p>
-      <w:r>
-        <w:t>6. Verify th</w:t>
-      </w:r>
-      <w:r>
-        <w:t>at the expanded description is not visible</w:t>
-      </w:r>
-    </w:p>
-    <w:p>
-      <w:r>
-        <w:t>Expected: The description starts collapsed</w:t>
-      </w:r>
-    </w:p>
-    <w:p>
-      <w:r>
-        <w:t>7. Click the Show more button</w:t>
-      </w:r>
-    </w:p>
-    <w:p>
-      <w:r>
-        <w:t>Expected: The description expands</w:t>
-      </w:r>
-    </w:p>
-    <w:p>
-      <w:r>
-        <w:t>8. Verify that the expanded description is visible</w:t>
-      </w:r>
-    </w:p>
-    <w:p>
-      <w:r>
-        <w:t>Expected: The rest of the description is shown</w:t>
-      </w:r>
-    </w:p>
-    <w:p/>
-    <w:p>
-      <w:r>
-        <w:rPr>
-          <w:b/>
-          <w:bCs/>
-        </w:rPr>
-        <w:t>Test Ca</w:t>
-      </w:r>
-      <w:r>
-        <w:rPr>
-          <w:b/>
-          <w:bCs/>
-        </w:rPr>
-        <w:t>se ID: TC-YT-025</w:t>
-      </w:r>
-    </w:p>
-    <w:p>
-      <w:r>
-        <w:t>Title: Open channel from a video</w:t>
-      </w:r>
-    </w:p>
-    <w:p>
-      <w:r>
-        <w:t>Precondition: User has internet access.</w:t>
-      </w:r>
-    </w:p>
-    <w:p>
-      <w:r>
-        <w:t>Steps:</w:t>
-      </w:r>
-    </w:p>
-    <w:p>
-      <w:r>
-        <w:t>1. Open https://www.youtube.com</w:t>
-      </w:r>
-    </w:p>
-    <w:p>
-      <w:r>
-        <w:t>Expected: YouTube homepage is displayed</w:t>
-      </w:r>
-    </w:p>
-    <w:p>
-      <w:r>
-        <w:t>2. Close the cookie consent dialog if it is displayed</w:t>
-      </w:r>
-    </w:p>
-    <w:p>
-      <w:r>
-        <w:t>Expected: The page is not covered</w:t>
-      </w:r>
-      <w:r>
-        <w:t xml:space="preserve"> by the consent dialog</w:t>
       </w:r>
     </w:p>
     <w:p>
@@ -2630,10 +2483,7 @@
     </w:p>
     <w:p>
       <w:r>
-        <w:t>Prec</w:t>
-      </w:r>
-      <w:r>
-        <w:t>ondition: User has internet access.</w:t>
+        <w:t>Precondition: User has internet access.</w:t>
       </w:r>
     </w:p>
     <w:p>
@@ -2664,10 +2514,7 @@
     </w:p>
     <w:p>
       <w:r>
-        <w:t>3. Enter "Playwright automation</w:t>
-      </w:r>
-      <w:r>
-        <w:t>" in the search box</w:t>
+        <w:t>3. Enter "Playwright automation" in the search box</w:t>
       </w:r>
     </w:p>
     <w:p>
@@ -2712,14 +2559,7 @@
           <w:b/>
           <w:bCs/>
         </w:rPr>
-        <w:t>Test Case ID: TC-YT-02</w:t>
-      </w:r>
-      <w:r>
-        <w:rPr>
-          <w:b/>
-          <w:bCs/>
-        </w:rPr>
-        <w:t>7</w:t>
+        <w:t>Test Case ID: TC-YT-027</w:t>
       </w:r>
     </w:p>
     <w:p>
@@ -2789,10 +2629,7 @@
     </w:p>
     <w:p>
       <w:r>
-        <w:t>6. Verify th</w:t>
-      </w:r>
-      <w:r>
-        <w:t>at the sign-in prompt is not visible</w:t>
+        <w:t>6. Verify that the sign-in prompt is not visible</w:t>
       </w:r>
     </w:p>
     <w:p>
@@ -2832,10 +2669,7 @@
     </w:p>
     <w:p>
       <w:r>
-        <w:t>Title: Subscribing wh</w:t>
-      </w:r>
-      <w:r>
-        <w:t>ile signed out asks for sign-in</w:t>
+        <w:t>Title: Subscribing while signed out asks for sign-in</w:t>
       </w:r>
     </w:p>
     <w:p>
@@ -2940,10 +2774,7 @@
     </w:p>
     <w:p>
       <w:r>
-        <w:t>Titl</w:t>
-      </w:r>
-      <w:r>
-        <w:t>e: Open the YouTube homepage</w:t>
+        <w:t>Title: Open the YouTube homepage</w:t>
       </w:r>
     </w:p>
     <w:p>
@@ -2974,10 +2805,7 @@
     </w:p>
     <w:p>
       <w:r>
-        <w:t>Expected: The page is not covered by the consent dialo</w:t>
-      </w:r>
-      <w:r>
-        <w:t>g</w:t>
+        <w:t>Expected: The page is not covered by the consent dialog</w:t>
       </w:r>
     </w:p>
     <w:p>
@@ -3007,10 +2835,7 @@
     </w:p>
     <w:p>
       <w:r>
-        <w:t>Expected: The search box is shown in the he</w:t>
-      </w:r>
-      <w:r>
-        <w:t>ader</w:t>
+        <w:t>Expected: The search box is shown in the header</w:t>
       </w:r>
     </w:p>
     <w:p/>
@@ -3090,10 +2915,7 @@
     </w:p>
     <w:p>
       <w:r>
-        <w:t>6. Verify th</w:t>
-      </w:r>
-      <w:r>
-        <w:t>at the video page is displayed</w:t>
+        <w:t>6. Verify that the video page is displayed</w:t>
       </w:r>
     </w:p>
     <w:p>
@@ -3168,10 +2990,7 @@
     </w:p>
     <w:p>
       <w:r>
-        <w:t xml:space="preserve">Expected: The page is not covered by the consent </w:t>
-      </w:r>
-      <w:r>
-        <w:t>dialog</w:t>
+        <w:t>Expected: The page is not covered by the consent dialog</w:t>
       </w:r>
     </w:p>
     <w:p>
@@ -3241,10 +3060,7 @@
     </w:p>
     <w:p>
       <w:r>
-        <w:t>Expected: The URL c</w:t>
-      </w:r>
-      <w:r>
-        <w:t>ontains /</w:t>
+        <w:t>Expected: The URL contains /</w:t>
       </w:r>
       <w:proofErr w:type="gramStart"/>
       <w:r>
@@ -3512,6 +3328,7 @@
   <w:style w:type="paragraph" w:default="1" w:styleId="Normal">
     <w:name w:val="Normal"/>
     <w:qFormat/>
+    <w:rsid w:val="000E577E"/>
   </w:style>
   <w:style w:type="paragraph" w:styleId="Heading1">
     <w:name w:val="heading 1"/>

</xml_diff>